<commit_message>
WP05: tekst pkt 1.3 i ceny (K2), poprawka wskaznika I1 (flota 10 naczep)
Co-Authored-By: Claude Sonnet 5.5 <noreply@anthropic.com>
Claude-Session: https://claude.ai/code/session_01672WnJhixnEcarbb7uiwfx
</commit_message>
<xml_diff>
--- a/Wskazniki_innowacyjnosci_1.2_i_1.4.docx
+++ b/Wskazniki_innowacyjnosci_1.2_i_1.4.docx
@@ -2051,7 +2051,7 @@
           <w:color w:val="666666"/>
           <w:sz w:val="17"/>
         </w:rPr>
-        <w:t xml:space="preserve"> [225 znaków]</w:t>
+        <w:t xml:space="preserve"> [284 znaków]</w:t>
       </w:r>
     </w:p>
     <w:p>
@@ -2062,7 +2062,7 @@
         <w:rPr>
           <w:b w:val="0"/>
         </w:rPr>
-        <w:t>Nie więcej niż 6 700 PLN/naczepa/rok dla floty 5 naczep: subskrypcja 349 PLN x 12 = 4 188 PLN, zestaw 7 500 PLN rozłożony na 5 lat = 1 500 PLN, licencja API 4 800 PLN rocznie podzielona na 5 naczep = 960 PLN, razem 6 648 PLN.</w:t>
+        <w:t>Nie więcej niż 6 200 PLN/naczepa/rok dla floty 10 naczep: subskrypcja 349 PLN x 12 = 4 188 PLN, zestaw 7 500 PLN rozłożony na 5 lat = 1 500 PLN, licencja API 4 800 PLN rocznie podzielona na 10 naczep = 480 PLN, razem 6 168 PLN. Przyjęta flota odniesienia jest taka sama jak w pkt 1.3.</w:t>
       </w:r>
     </w:p>
     <w:p>

</xml_diff>